<commit_message>
Finalize RTR-aligned manuscript and artifact
</commit_message>
<xml_diff>
--- a/RTR_and_paper/reviewer/bioETH-PRS_RTR_response.docx
+++ b/RTR_and_paper/reviewer/bioETH-PRS_RTR_response.docx
@@ -481,7 +481,7 @@
     </w:p>
     <w:p>
       <w:r>
-        <w:t>We thank the reviewer for emphasizing this point. The manuscript now describes the feature as a randomized risk category and states explicitly that it does not provide differential privacy. A random integer from 0 through B-1 is added before the category is assigned. Its exact mean is (B-1)/2; with B=128, the mean is 63.5 and the contract uses an integer threshold adjustment of 64.</w:t>
+        <w:t>We thank the reviewer for emphasizing this point. The manuscript now describes the feature as a randomized risk category and states explicitly that it does not provide differential privacy. A random integer from 0 through B-1 is added before the category is assigned. Its exact mean is (B-1)/2; in the local B=128 study, the mean is 63.5 and the contract uses an integer threshold adjustment of 64. We did not evaluate a randomized category release on Sepolia.</w:t>
       </w:r>
     </w:p>
     <w:p>
@@ -1619,7 +1619,7 @@
     </w:p>
     <w:p>
       <w:r>
-        <w:t>We thank the reviewer for asking the question in this direct way. The manuscript now explains who is responsible for each part of the result. The person or laboratory preparing the genotype data is responsible for alignment and quality checks. The model provider is responsible for the weights, thresholds, and scientific validity of the model. The contracts carry out the encoded weighted sum, and the fhEVM services perform encrypted operations and decrypt results only for the intended requester. An independent calculation of Equation 1 provides a numerical comparison.</w:t>
+        <w:t>We thank the reviewer for asking the question in this direct way. The manuscript now explains who is responsible for each part of the result. The person or laboratory preparing the genotype data is responsible for alignment and quality checks. The model provider is responsible for the weights, thresholds, and scientific validity of the model. The contracts carry out the encoded weighted sum, while the fhEVM services perform the encrypted operations and apply the configured release permissions. Raw scores are authorized only for the requester, whereas randomized categories are publicly decryptable. An independent calculation of Equation 1 provides a numerical comparison.</w:t>
       </w:r>
     </w:p>
     <w:p>
@@ -1736,7 +1736,7 @@
     </w:p>
     <w:p>
       <w:r>
-        <w:t>The manuscript now describes this order directly in the text: genotype checks and effect-allele alignment, encryption, contract calculation, release to the intended requester, and decoding.</w:t>
+        <w:t>The manuscript now describes this order directly in the text: genotype checks and effect-allele alignment, encryption, contract calculation, and either requester-authorized raw-score release or public randomized-category release.</w:t>
       </w:r>
     </w:p>
     <w:p>
@@ -1838,7 +1838,7 @@
     </w:p>
     <w:p>
       <w:r>
-        <w:t>We thank the reviewer and agree that an independent implementation provides an important practical check on the calculation. To make this verification transparent, the manuscript includes a worked three-SNP example showing that the original PRS and its nonnegative integer representation produce the same score. We also independently recalculated Equation 1 for all 200 public-weight local test cases and obtained exact agreement with every bioETH-PRS result. The independent implementation and example inputs are included with the study materials so that others can repeat these checks. Although this agreement provides strong practical evidence that the algorithm has been implemented correctly, it is not a formal mathematical proof. Subject to the stated Ethereum and fhEVM security assumptions, the network provides consensus-enforced execution of the deployed contract logic and fhEVM performs the specified encrypted arithmetic; in other words, it ensures that the registered algorithm is executed consistently on the submitted encrypted values. This guarantee does not extend to the biological correctness of those values. The network cannot determine whether the encrypted genotypes came from the stated individual, whether laboratory processing and quality control were performed correctly, or whether genome build, variant order, missing values, dosage coding, and effect-allele alignment were handled appropriately. These aspects remain the responsibility of the laboratory or data preparer, while the model provider remains responsible for the validity, calibration, and intended population of the PRS model.</w:t>
+        <w:t>We thank the reviewer and agree that an independent implementation provides an important practical check on the calculation. To make this verification transparent, the manuscript includes a worked three-SNP example showing that the original PRS and its nonnegative integer representation produce the same score. We also independently recalculated Equation 1 for all 200 public-weight local test cases and obtained exact agreement with every bioETH-PRS result. The independent implementation and example inputs are included with the study materials so that others can repeat these checks. Although this agreement provides strong practical evidence that the algorithm has been implemented correctly, it is not a formal mathematical proof. Ethereum consensus orders and executes the deployed Solidity contract logic, but it does not independently recompute or verify the encrypted arithmetic. Correct encrypted arithmetic and decryption therefore still depend on the fhEVM services behaving as specified. These guarantees concern execution on the submitted encrypted values; they do not establish the biological correctness of those values. The network cannot determine whether the encrypted genotypes came from the stated individual, whether laboratory processing and quality control were performed correctly, or whether genome build, variant order, missing values, dosage coding, and effect-allele alignment were handled appropriately. These aspects remain the responsibility of the laboratory or data preparer, while the model provider remains responsible for the validity, calibration, and intended population of the PRS model.</w:t>
       </w:r>
     </w:p>
     <w:p>

</xml_diff>